<commit_message>
added all the files
</commit_message>
<xml_diff>
--- a/QuizApp/WipriAssignments_QuizApp_Output.docx
+++ b/QuizApp/WipriAssignments_QuizApp_Output.docx
@@ -137,7 +137,6 @@
         <w:rPr>
           <w:noProof/>
         </w:rPr>
-        <w:lastRenderedPageBreak/>
         <w:t>2.Get All Questions</w:t>
       </w:r>
     </w:p>
@@ -317,7 +316,6 @@
         <w:rPr>
           <w:noProof/>
         </w:rPr>
-        <w:lastRenderedPageBreak/>
         <w:t>3.Deleting Questions by ID.</w:t>
       </w:r>
     </w:p>
@@ -478,7 +476,6 @@
         <w:rPr>
           <w:noProof/>
         </w:rPr>
-        <w:lastRenderedPageBreak/>
         <w:t>5</w:t>
       </w:r>
       <w:r>
@@ -540,14 +537,12 @@
       <w:r>
         <w:t>6.Creating Quiz</w:t>
       </w:r>
-    </w:p>
-    <w:p>
       <w:r>
         <w:rPr>
           <w:noProof/>
         </w:rPr>
         <w:drawing>
-          <wp:inline distT="0" distB="0" distL="0" distR="0" wp14:anchorId="7D7821A3" wp14:editId="78C03AFB">
+          <wp:inline distT="0" distB="0" distL="0" distR="0" wp14:anchorId="632F2D67" wp14:editId="13029B64">
             <wp:extent cx="5731510" cy="2795270"/>
             <wp:effectExtent l="0" t="0" r="2540" b="5080"/>
             <wp:docPr id="1033941523" name="Picture 9"/>
@@ -588,10 +583,13 @@
           </wp:inline>
         </w:drawing>
       </w:r>
-      <w:r>
-        <w:rPr>
-          <w:noProof/>
-        </w:rPr>
+    </w:p>
+    <w:p>
+      <w:r>
+        <w:rPr>
+          <w:noProof/>
+        </w:rPr>
+        <w:lastRenderedPageBreak/>
         <w:drawing>
           <wp:inline distT="0" distB="0" distL="0" distR="0" wp14:anchorId="6C8FB8A0" wp14:editId="463EF816">
             <wp:extent cx="5731510" cy="2508885"/>
@@ -645,23 +643,14 @@
         <w:rPr>
           <w:noProof/>
         </w:rPr>
-        <w:lastRenderedPageBreak/>
-        <w:t>7.Getting Quiz By Id</w:t>
-      </w:r>
-    </w:p>
-    <w:p>
-      <w:r>
-        <w:rPr>
-          <w:noProof/>
-        </w:rPr>
         <w:drawing>
-          <wp:anchor distT="0" distB="0" distL="114300" distR="114300" simplePos="0" relativeHeight="251658240" behindDoc="0" locked="0" layoutInCell="1" allowOverlap="1" wp14:anchorId="15F23A08" wp14:editId="3DB11B27">
-            <wp:simplePos x="914400" y="1200150"/>
-            <wp:positionH relativeFrom="column">
+          <wp:anchor distT="0" distB="0" distL="114300" distR="114300" simplePos="0" relativeHeight="251658240" behindDoc="0" locked="0" layoutInCell="1" allowOverlap="1" wp14:anchorId="15F23A08" wp14:editId="31F0C1EC">
+            <wp:simplePos x="0" y="0"/>
+            <wp:positionH relativeFrom="margin">
               <wp:align>left</wp:align>
             </wp:positionH>
             <wp:positionV relativeFrom="paragraph">
-              <wp:align>top</wp:align>
+              <wp:posOffset>331470</wp:posOffset>
             </wp:positionV>
             <wp:extent cx="5731510" cy="2816225"/>
             <wp:effectExtent l="0" t="0" r="2540" b="3175"/>
@@ -705,6 +694,62 @@
         </w:drawing>
       </w:r>
       <w:r>
+        <w:rPr>
+          <w:noProof/>
+        </w:rPr>
+        <w:t>7.Getting Quiz By Id</w:t>
+      </w:r>
+    </w:p>
+    <w:p/>
+    <w:p>
+      <w:r>
+        <w:rPr>
+          <w:noProof/>
+        </w:rPr>
+        <w:lastRenderedPageBreak/>
+        <w:drawing>
+          <wp:inline distT="0" distB="0" distL="0" distR="0" wp14:anchorId="3A0A77F7" wp14:editId="54A1271D">
+            <wp:extent cx="5731510" cy="2675890"/>
+            <wp:effectExtent l="0" t="0" r="2540" b="0"/>
+            <wp:docPr id="1582281134" name="Picture 1"/>
+            <wp:cNvGraphicFramePr>
+              <a:graphicFrameLocks xmlns:a="http://schemas.openxmlformats.org/drawingml/2006/main" noChangeAspect="1"/>
+            </wp:cNvGraphicFramePr>
+            <a:graphic xmlns:a="http://schemas.openxmlformats.org/drawingml/2006/main">
+              <a:graphicData uri="http://schemas.openxmlformats.org/drawingml/2006/picture">
+                <pic:pic xmlns:pic="http://schemas.openxmlformats.org/drawingml/2006/picture">
+                  <pic:nvPicPr>
+                    <pic:cNvPr id="1582281134" name="Picture 1582281134"/>
+                    <pic:cNvPicPr/>
+                  </pic:nvPicPr>
+                  <pic:blipFill>
+                    <a:blip r:embed="rId17" cstate="print">
+                      <a:extLst>
+                        <a:ext uri="{28A0092B-C50C-407E-A947-70E740481C1C}">
+                          <a14:useLocalDpi xmlns:a14="http://schemas.microsoft.com/office/drawing/2010/main" val="0"/>
+                        </a:ext>
+                      </a:extLst>
+                    </a:blip>
+                    <a:stretch>
+                      <a:fillRect/>
+                    </a:stretch>
+                  </pic:blipFill>
+                  <pic:spPr>
+                    <a:xfrm>
+                      <a:off x="0" y="0"/>
+                      <a:ext cx="5731510" cy="2675890"/>
+                    </a:xfrm>
+                    <a:prstGeom prst="rect">
+                      <a:avLst/>
+                    </a:prstGeom>
+                  </pic:spPr>
+                </pic:pic>
+              </a:graphicData>
+            </a:graphic>
+          </wp:inline>
+        </w:drawing>
+      </w:r>
+      <w:r>
         <w:br w:type="textWrapping" w:clear="all"/>
         <w:t xml:space="preserve">8.My </w:t>
       </w:r>
@@ -736,7 +781,7 @@
                     <pic:cNvPicPr/>
                   </pic:nvPicPr>
                   <pic:blipFill>
-                    <a:blip r:embed="rId17" cstate="print">
+                    <a:blip r:embed="rId18" cstate="print">
                       <a:extLst>
                         <a:ext uri="{28A0092B-C50C-407E-A947-70E740481C1C}">
                           <a14:useLocalDpi xmlns:a14="http://schemas.microsoft.com/office/drawing/2010/main" val="0"/>
@@ -763,8 +808,154 @@
         </w:drawing>
       </w:r>
     </w:p>
+    <w:p>
+      <w:r>
+        <w:t>9.Implementing AOP and Logging:</w:t>
+      </w:r>
+    </w:p>
+    <w:p>
+      <w:r>
+        <w:rPr>
+          <w:noProof/>
+        </w:rPr>
+        <w:lastRenderedPageBreak/>
+        <w:drawing>
+          <wp:inline distT="0" distB="0" distL="0" distR="0" wp14:anchorId="5DFFF48D" wp14:editId="79307FBB">
+            <wp:extent cx="5731510" cy="2784475"/>
+            <wp:effectExtent l="0" t="0" r="2540" b="0"/>
+            <wp:docPr id="865471616" name="Picture 2"/>
+            <wp:cNvGraphicFramePr>
+              <a:graphicFrameLocks xmlns:a="http://schemas.openxmlformats.org/drawingml/2006/main" noChangeAspect="1"/>
+            </wp:cNvGraphicFramePr>
+            <a:graphic xmlns:a="http://schemas.openxmlformats.org/drawingml/2006/main">
+              <a:graphicData uri="http://schemas.openxmlformats.org/drawingml/2006/picture">
+                <pic:pic xmlns:pic="http://schemas.openxmlformats.org/drawingml/2006/picture">
+                  <pic:nvPicPr>
+                    <pic:cNvPr id="865471616" name="Picture 865471616"/>
+                    <pic:cNvPicPr/>
+                  </pic:nvPicPr>
+                  <pic:blipFill>
+                    <a:blip r:embed="rId19" cstate="print">
+                      <a:extLst>
+                        <a:ext uri="{28A0092B-C50C-407E-A947-70E740481C1C}">
+                          <a14:useLocalDpi xmlns:a14="http://schemas.microsoft.com/office/drawing/2010/main" val="0"/>
+                        </a:ext>
+                      </a:extLst>
+                    </a:blip>
+                    <a:stretch>
+                      <a:fillRect/>
+                    </a:stretch>
+                  </pic:blipFill>
+                  <pic:spPr>
+                    <a:xfrm>
+                      <a:off x="0" y="0"/>
+                      <a:ext cx="5731510" cy="2784475"/>
+                    </a:xfrm>
+                    <a:prstGeom prst="rect">
+                      <a:avLst/>
+                    </a:prstGeom>
+                  </pic:spPr>
+                </pic:pic>
+              </a:graphicData>
+            </a:graphic>
+          </wp:inline>
+        </w:drawing>
+      </w:r>
+      <w:r>
+        <w:rPr>
+          <w:noProof/>
+        </w:rPr>
+        <w:drawing>
+          <wp:inline distT="0" distB="0" distL="0" distR="0" wp14:anchorId="3EA68F74" wp14:editId="2F08A1B6">
+            <wp:extent cx="5731510" cy="2714625"/>
+            <wp:effectExtent l="0" t="0" r="2540" b="9525"/>
+            <wp:docPr id="188797660" name="Picture 3"/>
+            <wp:cNvGraphicFramePr>
+              <a:graphicFrameLocks xmlns:a="http://schemas.openxmlformats.org/drawingml/2006/main" noChangeAspect="1"/>
+            </wp:cNvGraphicFramePr>
+            <a:graphic xmlns:a="http://schemas.openxmlformats.org/drawingml/2006/main">
+              <a:graphicData uri="http://schemas.openxmlformats.org/drawingml/2006/picture">
+                <pic:pic xmlns:pic="http://schemas.openxmlformats.org/drawingml/2006/picture">
+                  <pic:nvPicPr>
+                    <pic:cNvPr id="188797660" name="Picture 188797660"/>
+                    <pic:cNvPicPr/>
+                  </pic:nvPicPr>
+                  <pic:blipFill>
+                    <a:blip r:embed="rId20" cstate="print">
+                      <a:extLst>
+                        <a:ext uri="{28A0092B-C50C-407E-A947-70E740481C1C}">
+                          <a14:useLocalDpi xmlns:a14="http://schemas.microsoft.com/office/drawing/2010/main" val="0"/>
+                        </a:ext>
+                      </a:extLst>
+                    </a:blip>
+                    <a:stretch>
+                      <a:fillRect/>
+                    </a:stretch>
+                  </pic:blipFill>
+                  <pic:spPr>
+                    <a:xfrm>
+                      <a:off x="0" y="0"/>
+                      <a:ext cx="5731510" cy="2714625"/>
+                    </a:xfrm>
+                    <a:prstGeom prst="rect">
+                      <a:avLst/>
+                    </a:prstGeom>
+                  </pic:spPr>
+                </pic:pic>
+              </a:graphicData>
+            </a:graphic>
+          </wp:inline>
+        </w:drawing>
+      </w:r>
+      <w:r>
+        <w:rPr>
+          <w:noProof/>
+        </w:rPr>
+        <w:drawing>
+          <wp:inline distT="0" distB="0" distL="0" distR="0" wp14:anchorId="40450CE7" wp14:editId="2F2B6684">
+            <wp:extent cx="5731510" cy="2663190"/>
+            <wp:effectExtent l="0" t="0" r="2540" b="3810"/>
+            <wp:docPr id="1053306594" name="Picture 4"/>
+            <wp:cNvGraphicFramePr>
+              <a:graphicFrameLocks xmlns:a="http://schemas.openxmlformats.org/drawingml/2006/main" noChangeAspect="1"/>
+            </wp:cNvGraphicFramePr>
+            <a:graphic xmlns:a="http://schemas.openxmlformats.org/drawingml/2006/main">
+              <a:graphicData uri="http://schemas.openxmlformats.org/drawingml/2006/picture">
+                <pic:pic xmlns:pic="http://schemas.openxmlformats.org/drawingml/2006/picture">
+                  <pic:nvPicPr>
+                    <pic:cNvPr id="1053306594" name="Picture 1053306594"/>
+                    <pic:cNvPicPr/>
+                  </pic:nvPicPr>
+                  <pic:blipFill>
+                    <a:blip r:embed="rId21" cstate="print">
+                      <a:extLst>
+                        <a:ext uri="{28A0092B-C50C-407E-A947-70E740481C1C}">
+                          <a14:useLocalDpi xmlns:a14="http://schemas.microsoft.com/office/drawing/2010/main" val="0"/>
+                        </a:ext>
+                      </a:extLst>
+                    </a:blip>
+                    <a:stretch>
+                      <a:fillRect/>
+                    </a:stretch>
+                  </pic:blipFill>
+                  <pic:spPr>
+                    <a:xfrm>
+                      <a:off x="0" y="0"/>
+                      <a:ext cx="5731510" cy="2663190"/>
+                    </a:xfrm>
+                    <a:prstGeom prst="rect">
+                      <a:avLst/>
+                    </a:prstGeom>
+                  </pic:spPr>
+                </pic:pic>
+              </a:graphicData>
+            </a:graphic>
+          </wp:inline>
+        </w:drawing>
+      </w:r>
+    </w:p>
     <w:sectPr>
-      <w:headerReference w:type="default" r:id="rId18"/>
+      <w:headerReference w:type="default" r:id="rId22"/>
       <w:pgSz w:w="11906" w:h="16838"/>
       <w:pgMar w:top="1440" w:right="1440" w:bottom="1440" w:left="1440" w:header="708" w:footer="708" w:gutter="0"/>
       <w:cols w:space="708"/>
@@ -841,6 +1032,19 @@
         <w:t>gowthamnakka4@gmail.com</w:t>
       </w:r>
     </w:hyperlink>
+  </w:p>
+  <w:p>
+    <w:pPr>
+      <w:pStyle w:val="Header"/>
+    </w:pPr>
+    <w:proofErr w:type="spellStart"/>
+    <w:r>
+      <w:t>QuizApplication</w:t>
+    </w:r>
+    <w:proofErr w:type="spellEnd"/>
+    <w:r>
+      <w:t xml:space="preserve"> Output:</w:t>
+    </w:r>
   </w:p>
   <w:p>
     <w:pPr>

</xml_diff>